<commit_message>
added complete module files for comment and stock module
</commit_message>
<xml_diff>
--- a/ipa_documentation_lam.docx
+++ b/ipa_documentation_lam.docx
@@ -5415,6 +5415,48 @@
     </w:p>
     <w:p>
       <w:pPr>
+        <w:rPr>
+          <w:rFonts w:ascii="Times New Roman" w:hAnsi="Times New Roman" w:cs="Times New Roman"/>
+          <w:color w:val="153D63" w:themeColor="text2" w:themeTint="E6"/>
+          <w:lang w:val="en-GB"/>
+        </w:rPr>
+      </w:pPr>
+      <w:r>
+        <w:rPr>
+          <w:rFonts w:ascii="Times New Roman" w:hAnsi="Times New Roman" w:cs="Times New Roman"/>
+          <w:color w:val="153D63" w:themeColor="text2" w:themeTint="E6"/>
+          <w:lang w:val="en-GB"/>
+        </w:rPr>
+        <w:t>Git will be used as version control in this project</w:t>
+      </w:r>
+      <w:r>
+        <w:rPr>
+          <w:rFonts w:ascii="Times New Roman" w:hAnsi="Times New Roman" w:cs="Times New Roman"/>
+          <w:color w:val="153D63" w:themeColor="text2" w:themeTint="E6"/>
+          <w:lang w:val="en-GB"/>
+        </w:rPr>
+        <w:t>.</w:t>
+      </w:r>
+      <w:r>
+        <w:rPr>
+          <w:rFonts w:ascii="Times New Roman" w:hAnsi="Times New Roman" w:cs="Times New Roman"/>
+          <w:color w:val="153D63" w:themeColor="text2" w:themeTint="E6"/>
+          <w:lang w:val="en-GB"/>
+        </w:rPr>
+        <w:t xml:space="preserve"> All project related products will be uploaded to a custom GitHub repository, to which all experts will have access. </w:t>
+      </w:r>
+    </w:p>
+    <w:p>
+      <w:pPr>
+        <w:rPr>
+          <w:rFonts w:ascii="Times New Roman" w:hAnsi="Times New Roman" w:cs="Times New Roman"/>
+          <w:color w:val="000000" w:themeColor="text1"/>
+          <w:lang w:val="en-GB"/>
+        </w:rPr>
+      </w:pPr>
+    </w:p>
+    <w:p>
+      <w:pPr>
         <w:pStyle w:val="Heading1"/>
         <w:rPr>
           <w:rFonts w:cs="Times New Roman"/>
@@ -5597,6 +5639,24 @@
     </w:p>
     <w:p>
       <w:pPr>
+        <w:rPr>
+          <w:rFonts w:ascii="Times New Roman" w:hAnsi="Times New Roman" w:cs="Times New Roman"/>
+          <w:color w:val="000000" w:themeColor="text1"/>
+          <w:lang w:val="en-GB"/>
+        </w:rPr>
+      </w:pPr>
+    </w:p>
+    <w:p>
+      <w:pPr>
+        <w:rPr>
+          <w:rFonts w:ascii="Times New Roman" w:hAnsi="Times New Roman" w:cs="Times New Roman"/>
+          <w:color w:val="000000" w:themeColor="text1"/>
+          <w:lang w:val="en-GB"/>
+        </w:rPr>
+      </w:pPr>
+    </w:p>
+    <w:p>
+      <w:pPr>
         <w:pStyle w:val="Heading3"/>
         <w:rPr>
           <w:rFonts w:cs="Times New Roman"/>
@@ -5669,6 +5729,7 @@
           <w:color w:val="000000" w:themeColor="text1"/>
           <w:lang w:val="en-GB"/>
         </w:rPr>
+        <w:lastRenderedPageBreak/>
         <w:t>Technical requirements</w:t>
       </w:r>
       <w:bookmarkEnd w:id="11"/>
@@ -5727,10 +5788,553 @@
           <w:color w:val="000000" w:themeColor="text1"/>
           <w:lang w:val="en-GB"/>
         </w:rPr>
+        <w:t>Prior knowledge</w:t>
+      </w:r>
+      <w:bookmarkEnd w:id="13"/>
+    </w:p>
+    <w:p>
+      <w:pPr>
+        <w:rPr>
+          <w:rFonts w:ascii="Times New Roman" w:hAnsi="Times New Roman" w:cs="Times New Roman"/>
+          <w:color w:val="000000" w:themeColor="text1"/>
+          <w:lang w:val="en-GB"/>
+        </w:rPr>
+      </w:pPr>
+    </w:p>
+    <w:p>
+      <w:pPr>
+        <w:pStyle w:val="Heading2"/>
+        <w:rPr>
+          <w:rFonts w:cs="Times New Roman"/>
+          <w:color w:val="000000" w:themeColor="text1"/>
+          <w:lang w:val="en-GB"/>
+        </w:rPr>
+      </w:pPr>
+      <w:bookmarkStart w:id="14" w:name="_Toc226443698"/>
+      <w:r>
+        <w:rPr>
+          <w:rFonts w:cs="Times New Roman"/>
+          <w:color w:val="000000" w:themeColor="text1"/>
+          <w:lang w:val="en-GB"/>
+        </w:rPr>
+        <w:t>Preliminary</w:t>
+      </w:r>
+      <w:r>
+        <w:rPr>
+          <w:rFonts w:cs="Times New Roman"/>
+          <w:color w:val="000000" w:themeColor="text1"/>
+          <w:lang w:val="en-GB"/>
+        </w:rPr>
+        <w:t xml:space="preserve"> work</w:t>
+      </w:r>
+      <w:bookmarkEnd w:id="14"/>
+    </w:p>
+    <w:p>
+      <w:pPr>
+        <w:rPr>
+          <w:rFonts w:ascii="Times New Roman" w:hAnsi="Times New Roman" w:cs="Times New Roman"/>
+          <w:color w:val="000000" w:themeColor="text1"/>
+          <w:lang w:val="en-GB"/>
+        </w:rPr>
+      </w:pPr>
+    </w:p>
+    <w:p>
+      <w:pPr>
+        <w:pStyle w:val="Heading2"/>
+        <w:rPr>
+          <w:rFonts w:cs="Times New Roman"/>
+          <w:color w:val="000000" w:themeColor="text1"/>
+          <w:lang w:val="en-GB"/>
+        </w:rPr>
+      </w:pPr>
+      <w:bookmarkStart w:id="15" w:name="_Toc226443699"/>
+      <w:r>
+        <w:rPr>
+          <w:rFonts w:cs="Times New Roman"/>
+          <w:color w:val="000000" w:themeColor="text1"/>
+          <w:lang w:val="en-GB"/>
+        </w:rPr>
+        <w:t>New learning content</w:t>
+      </w:r>
+      <w:bookmarkEnd w:id="15"/>
+    </w:p>
+    <w:p>
+      <w:pPr>
+        <w:rPr>
+          <w:rFonts w:ascii="Times New Roman" w:hAnsi="Times New Roman" w:cs="Times New Roman"/>
+          <w:color w:val="000000" w:themeColor="text1"/>
+          <w:lang w:val="en-GB"/>
+        </w:rPr>
+      </w:pPr>
+    </w:p>
+    <w:p>
+      <w:pPr>
+        <w:pStyle w:val="Heading2"/>
+        <w:rPr>
+          <w:rFonts w:cs="Times New Roman"/>
+          <w:color w:val="000000" w:themeColor="text1"/>
+          <w:lang w:val="en-GB"/>
+        </w:rPr>
+      </w:pPr>
+      <w:bookmarkStart w:id="16" w:name="_Toc226443700"/>
+      <w:r>
+        <w:rPr>
+          <w:rFonts w:cs="Times New Roman"/>
+          <w:color w:val="000000" w:themeColor="text1"/>
+          <w:lang w:val="en-GB"/>
+        </w:rPr>
+        <w:t>Time plan</w:t>
+      </w:r>
+      <w:bookmarkEnd w:id="16"/>
+    </w:p>
+    <w:p>
+      <w:pPr>
+        <w:rPr>
+          <w:rFonts w:ascii="Times New Roman" w:hAnsi="Times New Roman" w:cs="Times New Roman"/>
+          <w:color w:val="000000" w:themeColor="text1"/>
+          <w:lang w:val="en-GB"/>
+        </w:rPr>
+      </w:pPr>
+    </w:p>
+    <w:p>
+      <w:pPr>
+        <w:pStyle w:val="Heading2"/>
+        <w:rPr>
+          <w:rFonts w:cs="Times New Roman"/>
+          <w:color w:val="000000" w:themeColor="text1"/>
+          <w:lang w:val="en-GB"/>
+        </w:rPr>
+      </w:pPr>
+      <w:bookmarkStart w:id="17" w:name="_Toc226443701"/>
+      <w:r>
+        <w:rPr>
+          <w:rFonts w:cs="Times New Roman"/>
+          <w:color w:val="000000" w:themeColor="text1"/>
+          <w:lang w:val="en-GB"/>
+        </w:rPr>
+        <w:t>Work journal</w:t>
+      </w:r>
+      <w:bookmarkEnd w:id="17"/>
+    </w:p>
+    <w:p>
+      <w:pPr>
+        <w:rPr>
+          <w:rFonts w:ascii="Times New Roman" w:hAnsi="Times New Roman" w:cs="Times New Roman"/>
+          <w:color w:val="000000" w:themeColor="text1"/>
+          <w:lang w:val="en-GB"/>
+        </w:rPr>
+      </w:pPr>
+    </w:p>
+    <w:p>
+      <w:pPr>
+        <w:pStyle w:val="Heading3"/>
+        <w:rPr>
+          <w:rFonts w:cs="Times New Roman"/>
+          <w:color w:val="000000" w:themeColor="text1"/>
+          <w:lang w:val="en-GB"/>
+        </w:rPr>
+      </w:pPr>
+      <w:bookmarkStart w:id="18" w:name="_Toc226443702"/>
+      <w:r>
+        <w:rPr>
+          <w:rFonts w:cs="Times New Roman"/>
+          <w:color w:val="000000" w:themeColor="text1"/>
+          <w:lang w:val="en-GB"/>
+        </w:rPr>
+        <w:t>Tuesday</w:t>
+      </w:r>
+      <w:r>
+        <w:rPr>
+          <w:rFonts w:cs="Times New Roman"/>
+          <w:color w:val="000000" w:themeColor="text1"/>
+          <w:lang w:val="en-GB"/>
+        </w:rPr>
+        <w:t xml:space="preserve">, </w:t>
+      </w:r>
+      <w:r>
+        <w:rPr>
+          <w:rFonts w:cs="Times New Roman"/>
+          <w:color w:val="000000" w:themeColor="text1"/>
+          <w:lang w:val="en-GB"/>
+        </w:rPr>
+        <w:t>07.04.2026</w:t>
+      </w:r>
+      <w:bookmarkEnd w:id="18"/>
+    </w:p>
+    <w:p>
+      <w:pPr>
+        <w:rPr>
+          <w:rFonts w:ascii="Times New Roman" w:hAnsi="Times New Roman" w:cs="Times New Roman"/>
+          <w:color w:val="000000" w:themeColor="text1"/>
+          <w:lang w:val="en-GB"/>
+        </w:rPr>
+      </w:pPr>
+    </w:p>
+    <w:p>
+      <w:pPr>
+        <w:rPr>
+          <w:rFonts w:ascii="Times New Roman" w:hAnsi="Times New Roman" w:cs="Times New Roman"/>
+          <w:color w:val="000000" w:themeColor="text1"/>
+          <w:lang w:val="en-GB"/>
+        </w:rPr>
+      </w:pPr>
+      <w:r>
+        <w:rPr>
+          <w:rFonts w:ascii="Times New Roman" w:hAnsi="Times New Roman" w:cs="Times New Roman"/>
+          <w:color w:val="000000" w:themeColor="text1"/>
+          <w:lang w:val="en-GB"/>
+        </w:rPr>
+        <w:t>Setup code base</w:t>
+      </w:r>
+      <w:r>
+        <w:rPr>
+          <w:rFonts w:ascii="Times New Roman" w:hAnsi="Times New Roman" w:cs="Times New Roman"/>
+          <w:color w:val="000000" w:themeColor="text1"/>
+          <w:lang w:val="en-GB"/>
+        </w:rPr>
+        <w:t xml:space="preserve"> + DB</w:t>
+      </w:r>
+    </w:p>
+    <w:p>
+      <w:pPr>
+        <w:rPr>
+          <w:rFonts w:ascii="Times New Roman" w:hAnsi="Times New Roman" w:cs="Times New Roman"/>
+          <w:color w:val="000000" w:themeColor="text1"/>
+          <w:lang w:val="en-GB"/>
+        </w:rPr>
+      </w:pPr>
+      <w:r>
+        <w:rPr>
+          <w:rFonts w:ascii="Times New Roman" w:hAnsi="Times New Roman" w:cs="Times New Roman"/>
+          <w:color w:val="000000" w:themeColor="text1"/>
+          <w:lang w:val="en-GB"/>
+        </w:rPr>
+        <w:t>Tested BE – DB connection</w:t>
+      </w:r>
+    </w:p>
+    <w:p>
+      <w:pPr>
+        <w:rPr>
+          <w:rFonts w:ascii="Times New Roman" w:hAnsi="Times New Roman" w:cs="Times New Roman"/>
+          <w:color w:val="000000" w:themeColor="text1"/>
+          <w:lang w:val="en-GB"/>
+        </w:rPr>
+      </w:pPr>
+      <w:r>
+        <w:rPr>
+          <w:rFonts w:ascii="Times New Roman" w:hAnsi="Times New Roman" w:cs="Times New Roman"/>
+          <w:color w:val="000000" w:themeColor="text1"/>
+          <w:lang w:val="en-GB"/>
+        </w:rPr>
+        <w:t xml:space="preserve">Started </w:t>
+      </w:r>
+      <w:proofErr w:type="spellStart"/>
+      <w:r>
+        <w:rPr>
+          <w:rFonts w:ascii="Times New Roman" w:hAnsi="Times New Roman" w:cs="Times New Roman"/>
+          <w:color w:val="000000" w:themeColor="text1"/>
+          <w:lang w:val="en-GB"/>
+        </w:rPr>
+        <w:t>Informieren</w:t>
+      </w:r>
+      <w:proofErr w:type="spellEnd"/>
+      <w:r>
+        <w:rPr>
+          <w:rFonts w:ascii="Times New Roman" w:hAnsi="Times New Roman" w:cs="Times New Roman"/>
+          <w:color w:val="000000" w:themeColor="text1"/>
+          <w:lang w:val="en-GB"/>
+        </w:rPr>
+        <w:t xml:space="preserve"> and </w:t>
+      </w:r>
+      <w:proofErr w:type="spellStart"/>
+      <w:r>
+        <w:rPr>
+          <w:rFonts w:ascii="Times New Roman" w:hAnsi="Times New Roman" w:cs="Times New Roman"/>
+          <w:color w:val="000000" w:themeColor="text1"/>
+          <w:lang w:val="en-GB"/>
+        </w:rPr>
+        <w:t>Planen</w:t>
+      </w:r>
+      <w:proofErr w:type="spellEnd"/>
+    </w:p>
+    <w:p>
+      <w:pPr>
+        <w:rPr>
+          <w:rFonts w:ascii="Times New Roman" w:hAnsi="Times New Roman" w:cs="Times New Roman"/>
+          <w:color w:val="000000" w:themeColor="text1"/>
+          <w:lang w:val="en-GB"/>
+        </w:rPr>
+      </w:pPr>
+    </w:p>
+    <w:p>
+      <w:pPr>
+        <w:rPr>
+          <w:rFonts w:ascii="Times New Roman" w:hAnsi="Times New Roman" w:cs="Times New Roman"/>
+          <w:color w:val="000000" w:themeColor="text1"/>
+          <w:lang w:val="en-GB"/>
+        </w:rPr>
+      </w:pPr>
+    </w:p>
+    <w:p>
+      <w:pPr>
+        <w:pStyle w:val="Heading3"/>
+        <w:rPr>
+          <w:rFonts w:cs="Times New Roman"/>
+          <w:color w:val="000000" w:themeColor="text1"/>
+          <w:lang w:val="en-GB"/>
+        </w:rPr>
+      </w:pPr>
+      <w:bookmarkStart w:id="19" w:name="_Toc226443703"/>
+      <w:r>
+        <w:rPr>
+          <w:rFonts w:cs="Times New Roman"/>
+          <w:color w:val="000000" w:themeColor="text1"/>
+          <w:lang w:val="en-GB"/>
+        </w:rPr>
+        <w:t>Wednesday, 08.04.2026</w:t>
+      </w:r>
+      <w:bookmarkEnd w:id="19"/>
+    </w:p>
+    <w:p>
+      <w:pPr>
+        <w:rPr>
+          <w:rFonts w:ascii="Times New Roman" w:hAnsi="Times New Roman" w:cs="Times New Roman"/>
+          <w:color w:val="000000" w:themeColor="text1"/>
+          <w:lang w:val="en-GB"/>
+        </w:rPr>
+      </w:pPr>
+    </w:p>
+    <w:p>
+      <w:pPr>
+        <w:pStyle w:val="Heading3"/>
+        <w:rPr>
+          <w:rFonts w:cs="Times New Roman"/>
+          <w:color w:val="000000" w:themeColor="text1"/>
+          <w:lang w:val="en-GB"/>
+        </w:rPr>
+      </w:pPr>
+      <w:bookmarkStart w:id="20" w:name="_Toc226443704"/>
+      <w:r>
+        <w:rPr>
+          <w:rFonts w:cs="Times New Roman"/>
+          <w:color w:val="000000" w:themeColor="text1"/>
+          <w:lang w:val="en-GB"/>
+        </w:rPr>
+        <w:t>Thursday, 09.04.2026</w:t>
+      </w:r>
+      <w:bookmarkEnd w:id="20"/>
+    </w:p>
+    <w:p>
+      <w:pPr>
+        <w:rPr>
+          <w:rFonts w:ascii="Times New Roman" w:hAnsi="Times New Roman" w:cs="Times New Roman"/>
+          <w:color w:val="000000" w:themeColor="text1"/>
+          <w:lang w:val="en-GB"/>
+        </w:rPr>
+      </w:pPr>
+    </w:p>
+    <w:p>
+      <w:pPr>
+        <w:pStyle w:val="Heading3"/>
+        <w:rPr>
+          <w:rFonts w:cs="Times New Roman"/>
+          <w:color w:val="000000" w:themeColor="text1"/>
+          <w:lang w:val="en-GB"/>
+        </w:rPr>
+      </w:pPr>
+      <w:bookmarkStart w:id="21" w:name="_Toc226443705"/>
+      <w:r>
+        <w:rPr>
+          <w:rFonts w:cs="Times New Roman"/>
+          <w:color w:val="000000" w:themeColor="text1"/>
+          <w:lang w:val="en-GB"/>
+        </w:rPr>
+        <w:t>Friday, 10.04.2026</w:t>
+      </w:r>
+      <w:bookmarkEnd w:id="21"/>
+    </w:p>
+    <w:p>
+      <w:pPr>
+        <w:rPr>
+          <w:rFonts w:ascii="Times New Roman" w:hAnsi="Times New Roman" w:cs="Times New Roman"/>
+          <w:color w:val="000000" w:themeColor="text1"/>
+          <w:lang w:val="en-GB"/>
+        </w:rPr>
+      </w:pPr>
+    </w:p>
+    <w:p>
+      <w:pPr>
+        <w:pStyle w:val="Heading3"/>
+        <w:rPr>
+          <w:rFonts w:cs="Times New Roman"/>
+          <w:color w:val="000000" w:themeColor="text1"/>
+          <w:lang w:val="en-GB"/>
+        </w:rPr>
+      </w:pPr>
+      <w:bookmarkStart w:id="22" w:name="_Toc226443706"/>
+      <w:r>
+        <w:rPr>
+          <w:rFonts w:cs="Times New Roman"/>
+          <w:color w:val="000000" w:themeColor="text1"/>
+          <w:lang w:val="en-GB"/>
+        </w:rPr>
         <w:lastRenderedPageBreak/>
-        <w:t>Prior knowledge</w:t>
-      </w:r>
-      <w:bookmarkEnd w:id="13"/>
+        <w:t xml:space="preserve">Tuesday, </w:t>
+      </w:r>
+      <w:r>
+        <w:rPr>
+          <w:rFonts w:cs="Times New Roman"/>
+          <w:color w:val="000000" w:themeColor="text1"/>
+          <w:lang w:val="en-GB"/>
+        </w:rPr>
+        <w:t>14.04.2026</w:t>
+      </w:r>
+      <w:bookmarkEnd w:id="22"/>
+    </w:p>
+    <w:p>
+      <w:pPr>
+        <w:rPr>
+          <w:rFonts w:ascii="Times New Roman" w:hAnsi="Times New Roman" w:cs="Times New Roman"/>
+          <w:color w:val="000000" w:themeColor="text1"/>
+          <w:lang w:val="en-GB"/>
+        </w:rPr>
+      </w:pPr>
+    </w:p>
+    <w:p>
+      <w:pPr>
+        <w:pStyle w:val="Heading3"/>
+        <w:rPr>
+          <w:rFonts w:cs="Times New Roman"/>
+          <w:color w:val="000000" w:themeColor="text1"/>
+          <w:lang w:val="en-GB"/>
+        </w:rPr>
+      </w:pPr>
+      <w:bookmarkStart w:id="23" w:name="_Toc226443707"/>
+      <w:r>
+        <w:rPr>
+          <w:rFonts w:cs="Times New Roman"/>
+          <w:color w:val="000000" w:themeColor="text1"/>
+          <w:lang w:val="en-GB"/>
+        </w:rPr>
+        <w:t>Wednesday, 15.04.2026</w:t>
+      </w:r>
+      <w:bookmarkEnd w:id="23"/>
+    </w:p>
+    <w:p>
+      <w:pPr>
+        <w:rPr>
+          <w:rFonts w:ascii="Times New Roman" w:hAnsi="Times New Roman" w:cs="Times New Roman"/>
+          <w:color w:val="000000" w:themeColor="text1"/>
+          <w:lang w:val="en-GB"/>
+        </w:rPr>
+      </w:pPr>
+    </w:p>
+    <w:p>
+      <w:pPr>
+        <w:pStyle w:val="Heading3"/>
+        <w:rPr>
+          <w:rFonts w:cs="Times New Roman"/>
+          <w:color w:val="000000" w:themeColor="text1"/>
+          <w:lang w:val="en-GB"/>
+        </w:rPr>
+      </w:pPr>
+      <w:bookmarkStart w:id="24" w:name="_Toc226443708"/>
+      <w:r>
+        <w:rPr>
+          <w:rFonts w:cs="Times New Roman"/>
+          <w:color w:val="000000" w:themeColor="text1"/>
+          <w:lang w:val="en-GB"/>
+        </w:rPr>
+        <w:t>Thursday, 16.04.2026</w:t>
+      </w:r>
+      <w:bookmarkEnd w:id="24"/>
+    </w:p>
+    <w:p>
+      <w:pPr>
+        <w:rPr>
+          <w:rFonts w:ascii="Times New Roman" w:hAnsi="Times New Roman" w:cs="Times New Roman"/>
+          <w:color w:val="000000" w:themeColor="text1"/>
+          <w:lang w:val="en-GB"/>
+        </w:rPr>
+      </w:pPr>
+    </w:p>
+    <w:p>
+      <w:pPr>
+        <w:pStyle w:val="Heading3"/>
+        <w:rPr>
+          <w:rFonts w:cs="Times New Roman"/>
+          <w:color w:val="000000" w:themeColor="text1"/>
+          <w:lang w:val="en-GB"/>
+        </w:rPr>
+      </w:pPr>
+      <w:bookmarkStart w:id="25" w:name="_Toc226443709"/>
+      <w:r>
+        <w:rPr>
+          <w:rFonts w:cs="Times New Roman"/>
+          <w:color w:val="000000" w:themeColor="text1"/>
+          <w:lang w:val="en-GB"/>
+        </w:rPr>
+        <w:t>Friday, 17.04.2026</w:t>
+      </w:r>
+      <w:bookmarkEnd w:id="25"/>
+    </w:p>
+    <w:p>
+      <w:pPr>
+        <w:rPr>
+          <w:rFonts w:ascii="Times New Roman" w:hAnsi="Times New Roman" w:cs="Times New Roman"/>
+          <w:color w:val="000000" w:themeColor="text1"/>
+          <w:lang w:val="en-GB"/>
+        </w:rPr>
+      </w:pPr>
+    </w:p>
+    <w:p>
+      <w:pPr>
+        <w:pStyle w:val="Heading3"/>
+        <w:rPr>
+          <w:rFonts w:cs="Times New Roman"/>
+          <w:color w:val="000000" w:themeColor="text1"/>
+          <w:lang w:val="en-GB"/>
+        </w:rPr>
+      </w:pPr>
+      <w:bookmarkStart w:id="26" w:name="_Toc226443710"/>
+      <w:r>
+        <w:rPr>
+          <w:rFonts w:cs="Times New Roman"/>
+          <w:color w:val="000000" w:themeColor="text1"/>
+          <w:lang w:val="en-GB"/>
+        </w:rPr>
+        <w:t>Tuesday, 21.04.2026</w:t>
+      </w:r>
+      <w:bookmarkEnd w:id="26"/>
+    </w:p>
+    <w:p>
+      <w:pPr>
+        <w:rPr>
+          <w:rFonts w:ascii="Times New Roman" w:hAnsi="Times New Roman" w:cs="Times New Roman"/>
+          <w:color w:val="000000" w:themeColor="text1"/>
+          <w:lang w:val="en-GB"/>
+        </w:rPr>
+      </w:pPr>
+    </w:p>
+    <w:p>
+      <w:pPr>
+        <w:pStyle w:val="Heading3"/>
+        <w:rPr>
+          <w:rFonts w:cs="Times New Roman"/>
+          <w:color w:val="000000" w:themeColor="text1"/>
+          <w:lang w:val="en-GB"/>
+        </w:rPr>
+      </w:pPr>
+      <w:bookmarkStart w:id="27" w:name="_Toc226443711"/>
+      <w:r>
+        <w:rPr>
+          <w:rFonts w:cs="Times New Roman"/>
+          <w:color w:val="000000" w:themeColor="text1"/>
+          <w:lang w:val="en-GB"/>
+        </w:rPr>
+        <w:t>Wednesday, 22.04.2026</w:t>
+      </w:r>
+      <w:bookmarkEnd w:id="27"/>
     </w:p>
     <w:p>
       <w:pPr>
@@ -5750,24 +6354,45 @@
           <w:lang w:val="en-GB"/>
         </w:rPr>
       </w:pPr>
-      <w:bookmarkStart w:id="14" w:name="_Toc226443698"/>
-      <w:r>
-        <w:rPr>
-          <w:rFonts w:cs="Times New Roman"/>
-          <w:color w:val="000000" w:themeColor="text1"/>
-          <w:lang w:val="en-GB"/>
-        </w:rPr>
-        <w:t>Preliminary</w:t>
-      </w:r>
-      <w:r>
-        <w:rPr>
-          <w:rFonts w:cs="Times New Roman"/>
-          <w:color w:val="000000" w:themeColor="text1"/>
-          <w:lang w:val="en-GB"/>
-        </w:rPr>
-        <w:t xml:space="preserve"> work</w:t>
-      </w:r>
-      <w:bookmarkEnd w:id="14"/>
+      <w:bookmarkStart w:id="28" w:name="_Toc226443712"/>
+      <w:r>
+        <w:rPr>
+          <w:rFonts w:cs="Times New Roman"/>
+          <w:color w:val="000000" w:themeColor="text1"/>
+          <w:lang w:val="en-GB"/>
+        </w:rPr>
+        <w:t>Personal FAZIT</w:t>
+      </w:r>
+      <w:bookmarkEnd w:id="28"/>
+    </w:p>
+    <w:p>
+      <w:pPr>
+        <w:rPr>
+          <w:rFonts w:ascii="Times New Roman" w:hAnsi="Times New Roman" w:cs="Times New Roman"/>
+          <w:color w:val="000000" w:themeColor="text1"/>
+          <w:lang w:val="en-GB"/>
+        </w:rPr>
+      </w:pPr>
+    </w:p>
+    <w:p>
+      <w:pPr>
+        <w:pStyle w:val="Heading1"/>
+        <w:rPr>
+          <w:rFonts w:cs="Times New Roman"/>
+          <w:color w:val="000000" w:themeColor="text1"/>
+          <w:lang w:val="en-GB"/>
+        </w:rPr>
+      </w:pPr>
+      <w:bookmarkStart w:id="29" w:name="_Toc226443713"/>
+      <w:r>
+        <w:rPr>
+          <w:rFonts w:cs="Times New Roman"/>
+          <w:color w:val="000000" w:themeColor="text1"/>
+          <w:lang w:val="en-GB"/>
+        </w:rPr>
+        <w:t>Project</w:t>
+      </w:r>
+      <w:bookmarkEnd w:id="29"/>
     </w:p>
     <w:p>
       <w:pPr>
@@ -5787,16 +6412,132 @@
           <w:lang w:val="en-GB"/>
         </w:rPr>
       </w:pPr>
-      <w:bookmarkStart w:id="15" w:name="_Toc226443699"/>
-      <w:r>
-        <w:rPr>
-          <w:rFonts w:cs="Times New Roman"/>
-          <w:color w:val="000000" w:themeColor="text1"/>
-          <w:lang w:val="en-GB"/>
-        </w:rPr>
-        <w:t>New learning content</w:t>
-      </w:r>
-      <w:bookmarkEnd w:id="15"/>
+      <w:bookmarkStart w:id="30" w:name="_Toc226443714"/>
+      <w:r>
+        <w:rPr>
+          <w:rFonts w:cs="Times New Roman"/>
+          <w:color w:val="000000" w:themeColor="text1"/>
+          <w:lang w:val="en-GB"/>
+        </w:rPr>
+        <w:t>Summery</w:t>
+      </w:r>
+      <w:bookmarkEnd w:id="30"/>
+    </w:p>
+    <w:p>
+      <w:pPr>
+        <w:rPr>
+          <w:rFonts w:ascii="Times New Roman" w:hAnsi="Times New Roman" w:cs="Times New Roman"/>
+          <w:color w:val="000000" w:themeColor="text1"/>
+          <w:lang w:val="en-GB"/>
+        </w:rPr>
+      </w:pPr>
+    </w:p>
+    <w:p>
+      <w:pPr>
+        <w:pStyle w:val="Heading3"/>
+        <w:rPr>
+          <w:rFonts w:cs="Times New Roman"/>
+          <w:color w:val="000000" w:themeColor="text1"/>
+          <w:lang w:val="en-GB"/>
+        </w:rPr>
+      </w:pPr>
+      <w:bookmarkStart w:id="31" w:name="_Toc226443715"/>
+      <w:r>
+        <w:rPr>
+          <w:rFonts w:cs="Times New Roman"/>
+          <w:color w:val="000000" w:themeColor="text1"/>
+          <w:lang w:val="en-GB"/>
+        </w:rPr>
+        <w:t>Task</w:t>
+      </w:r>
+      <w:bookmarkEnd w:id="31"/>
+    </w:p>
+    <w:p>
+      <w:pPr>
+        <w:rPr>
+          <w:rFonts w:ascii="Times New Roman" w:hAnsi="Times New Roman" w:cs="Times New Roman"/>
+          <w:color w:val="000000" w:themeColor="text1"/>
+          <w:lang w:val="en-GB"/>
+        </w:rPr>
+      </w:pPr>
+    </w:p>
+    <w:p>
+      <w:pPr>
+        <w:pStyle w:val="Heading3"/>
+        <w:rPr>
+          <w:rFonts w:cs="Times New Roman"/>
+          <w:color w:val="000000" w:themeColor="text1"/>
+          <w:lang w:val="en-GB"/>
+        </w:rPr>
+      </w:pPr>
+      <w:bookmarkStart w:id="32" w:name="_Toc226443716"/>
+      <w:r>
+        <w:rPr>
+          <w:rFonts w:cs="Times New Roman"/>
+          <w:color w:val="000000" w:themeColor="text1"/>
+          <w:lang w:val="en-GB"/>
+        </w:rPr>
+        <w:t>Implementation</w:t>
+      </w:r>
+      <w:bookmarkEnd w:id="32"/>
+    </w:p>
+    <w:p>
+      <w:pPr>
+        <w:rPr>
+          <w:rFonts w:ascii="Times New Roman" w:hAnsi="Times New Roman" w:cs="Times New Roman"/>
+          <w:color w:val="000000" w:themeColor="text1"/>
+          <w:lang w:val="en-GB"/>
+        </w:rPr>
+      </w:pPr>
+    </w:p>
+    <w:p>
+      <w:pPr>
+        <w:pStyle w:val="Heading3"/>
+        <w:rPr>
+          <w:rFonts w:cs="Times New Roman"/>
+          <w:color w:val="000000" w:themeColor="text1"/>
+          <w:lang w:val="en-GB"/>
+        </w:rPr>
+      </w:pPr>
+      <w:bookmarkStart w:id="33" w:name="_Toc226443717"/>
+      <w:r>
+        <w:rPr>
+          <w:rFonts w:cs="Times New Roman"/>
+          <w:color w:val="000000" w:themeColor="text1"/>
+          <w:lang w:val="en-GB"/>
+        </w:rPr>
+        <w:t>Result</w:t>
+      </w:r>
+      <w:bookmarkEnd w:id="33"/>
+    </w:p>
+    <w:p>
+      <w:pPr>
+        <w:rPr>
+          <w:rFonts w:ascii="Times New Roman" w:hAnsi="Times New Roman" w:cs="Times New Roman"/>
+          <w:color w:val="000000" w:themeColor="text1"/>
+          <w:lang w:val="en-GB"/>
+        </w:rPr>
+      </w:pPr>
+    </w:p>
+    <w:p>
+      <w:pPr>
+        <w:pStyle w:val="Heading1"/>
+        <w:rPr>
+          <w:rFonts w:cs="Times New Roman"/>
+          <w:color w:val="000000" w:themeColor="text1"/>
+          <w:lang w:val="en-GB"/>
+        </w:rPr>
+      </w:pPr>
+      <w:bookmarkStart w:id="34" w:name="_Toc226443718"/>
+      <w:r>
+        <w:rPr>
+          <w:rFonts w:cs="Times New Roman"/>
+          <w:color w:val="000000" w:themeColor="text1"/>
+          <w:lang w:val="en-GB"/>
+        </w:rPr>
+        <w:t>IPERKA</w:t>
+      </w:r>
+      <w:bookmarkEnd w:id="34"/>
     </w:p>
     <w:p>
       <w:pPr>
@@ -5816,350 +6557,7 @@
           <w:lang w:val="en-GB"/>
         </w:rPr>
       </w:pPr>
-      <w:bookmarkStart w:id="16" w:name="_Toc226443700"/>
-      <w:r>
-        <w:rPr>
-          <w:rFonts w:cs="Times New Roman"/>
-          <w:color w:val="000000" w:themeColor="text1"/>
-          <w:lang w:val="en-GB"/>
-        </w:rPr>
-        <w:t>Time plan</w:t>
-      </w:r>
-      <w:bookmarkEnd w:id="16"/>
-    </w:p>
-    <w:p>
-      <w:pPr>
-        <w:rPr>
-          <w:rFonts w:ascii="Times New Roman" w:hAnsi="Times New Roman" w:cs="Times New Roman"/>
-          <w:color w:val="000000" w:themeColor="text1"/>
-          <w:lang w:val="en-GB"/>
-        </w:rPr>
-      </w:pPr>
-    </w:p>
-    <w:p>
-      <w:pPr>
-        <w:pStyle w:val="Heading2"/>
-        <w:rPr>
-          <w:rFonts w:cs="Times New Roman"/>
-          <w:color w:val="000000" w:themeColor="text1"/>
-          <w:lang w:val="en-GB"/>
-        </w:rPr>
-      </w:pPr>
-      <w:bookmarkStart w:id="17" w:name="_Toc226443701"/>
-      <w:r>
-        <w:rPr>
-          <w:rFonts w:cs="Times New Roman"/>
-          <w:color w:val="000000" w:themeColor="text1"/>
-          <w:lang w:val="en-GB"/>
-        </w:rPr>
-        <w:t>Work journal</w:t>
-      </w:r>
-      <w:bookmarkEnd w:id="17"/>
-    </w:p>
-    <w:p>
-      <w:pPr>
-        <w:rPr>
-          <w:rFonts w:ascii="Times New Roman" w:hAnsi="Times New Roman" w:cs="Times New Roman"/>
-          <w:color w:val="000000" w:themeColor="text1"/>
-          <w:lang w:val="en-GB"/>
-        </w:rPr>
-      </w:pPr>
-    </w:p>
-    <w:p>
-      <w:pPr>
-        <w:pStyle w:val="Heading3"/>
-        <w:rPr>
-          <w:rFonts w:cs="Times New Roman"/>
-          <w:color w:val="000000" w:themeColor="text1"/>
-          <w:lang w:val="en-GB"/>
-        </w:rPr>
-      </w:pPr>
-      <w:bookmarkStart w:id="18" w:name="_Toc226443702"/>
-      <w:r>
-        <w:rPr>
-          <w:rFonts w:cs="Times New Roman"/>
-          <w:color w:val="000000" w:themeColor="text1"/>
-          <w:lang w:val="en-GB"/>
-        </w:rPr>
-        <w:t>Tuesday</w:t>
-      </w:r>
-      <w:r>
-        <w:rPr>
-          <w:rFonts w:cs="Times New Roman"/>
-          <w:color w:val="000000" w:themeColor="text1"/>
-          <w:lang w:val="en-GB"/>
-        </w:rPr>
-        <w:t xml:space="preserve">, </w:t>
-      </w:r>
-      <w:r>
-        <w:rPr>
-          <w:rFonts w:cs="Times New Roman"/>
-          <w:color w:val="000000" w:themeColor="text1"/>
-          <w:lang w:val="en-GB"/>
-        </w:rPr>
-        <w:t>07.04.2026</w:t>
-      </w:r>
-      <w:bookmarkEnd w:id="18"/>
-    </w:p>
-    <w:p>
-      <w:pPr>
-        <w:rPr>
-          <w:rFonts w:ascii="Times New Roman" w:hAnsi="Times New Roman" w:cs="Times New Roman"/>
-          <w:color w:val="000000" w:themeColor="text1"/>
-          <w:lang w:val="en-GB"/>
-        </w:rPr>
-      </w:pPr>
-    </w:p>
-    <w:p>
-      <w:pPr>
-        <w:pStyle w:val="Heading3"/>
-        <w:rPr>
-          <w:rFonts w:cs="Times New Roman"/>
-          <w:color w:val="000000" w:themeColor="text1"/>
-          <w:lang w:val="en-GB"/>
-        </w:rPr>
-      </w:pPr>
-      <w:bookmarkStart w:id="19" w:name="_Toc226443703"/>
-      <w:r>
-        <w:rPr>
-          <w:rFonts w:cs="Times New Roman"/>
-          <w:color w:val="000000" w:themeColor="text1"/>
-          <w:lang w:val="en-GB"/>
-        </w:rPr>
-        <w:t>Wednesday, 08.04.2026</w:t>
-      </w:r>
-      <w:bookmarkEnd w:id="19"/>
-    </w:p>
-    <w:p>
-      <w:pPr>
-        <w:rPr>
-          <w:rFonts w:ascii="Times New Roman" w:hAnsi="Times New Roman" w:cs="Times New Roman"/>
-          <w:color w:val="000000" w:themeColor="text1"/>
-          <w:lang w:val="en-GB"/>
-        </w:rPr>
-      </w:pPr>
-    </w:p>
-    <w:p>
-      <w:pPr>
-        <w:pStyle w:val="Heading3"/>
-        <w:rPr>
-          <w:rFonts w:cs="Times New Roman"/>
-          <w:color w:val="000000" w:themeColor="text1"/>
-          <w:lang w:val="en-GB"/>
-        </w:rPr>
-      </w:pPr>
-      <w:bookmarkStart w:id="20" w:name="_Toc226443704"/>
-      <w:r>
-        <w:rPr>
-          <w:rFonts w:cs="Times New Roman"/>
-          <w:color w:val="000000" w:themeColor="text1"/>
-          <w:lang w:val="en-GB"/>
-        </w:rPr>
-        <w:t>Thursday, 09.04.2026</w:t>
-      </w:r>
-      <w:bookmarkEnd w:id="20"/>
-    </w:p>
-    <w:p>
-      <w:pPr>
-        <w:rPr>
-          <w:rFonts w:ascii="Times New Roman" w:hAnsi="Times New Roman" w:cs="Times New Roman"/>
-          <w:color w:val="000000" w:themeColor="text1"/>
-          <w:lang w:val="en-GB"/>
-        </w:rPr>
-      </w:pPr>
-    </w:p>
-    <w:p>
-      <w:pPr>
-        <w:pStyle w:val="Heading3"/>
-        <w:rPr>
-          <w:rFonts w:cs="Times New Roman"/>
-          <w:color w:val="000000" w:themeColor="text1"/>
-          <w:lang w:val="en-GB"/>
-        </w:rPr>
-      </w:pPr>
-      <w:bookmarkStart w:id="21" w:name="_Toc226443705"/>
-      <w:r>
-        <w:rPr>
-          <w:rFonts w:cs="Times New Roman"/>
-          <w:color w:val="000000" w:themeColor="text1"/>
-          <w:lang w:val="en-GB"/>
-        </w:rPr>
-        <w:t>Friday, 10.04.2026</w:t>
-      </w:r>
-      <w:bookmarkEnd w:id="21"/>
-    </w:p>
-    <w:p>
-      <w:pPr>
-        <w:rPr>
-          <w:rFonts w:ascii="Times New Roman" w:hAnsi="Times New Roman" w:cs="Times New Roman"/>
-          <w:color w:val="000000" w:themeColor="text1"/>
-          <w:lang w:val="en-GB"/>
-        </w:rPr>
-      </w:pPr>
-    </w:p>
-    <w:p>
-      <w:pPr>
-        <w:pStyle w:val="Heading3"/>
-        <w:rPr>
-          <w:rFonts w:cs="Times New Roman"/>
-          <w:color w:val="000000" w:themeColor="text1"/>
-          <w:lang w:val="en-GB"/>
-        </w:rPr>
-      </w:pPr>
-      <w:bookmarkStart w:id="22" w:name="_Toc226443706"/>
-      <w:r>
-        <w:rPr>
-          <w:rFonts w:cs="Times New Roman"/>
-          <w:color w:val="000000" w:themeColor="text1"/>
-          <w:lang w:val="en-GB"/>
-        </w:rPr>
-        <w:t xml:space="preserve">Tuesday, </w:t>
-      </w:r>
-      <w:r>
-        <w:rPr>
-          <w:rFonts w:cs="Times New Roman"/>
-          <w:color w:val="000000" w:themeColor="text1"/>
-          <w:lang w:val="en-GB"/>
-        </w:rPr>
-        <w:t>14.04.2026</w:t>
-      </w:r>
-      <w:bookmarkEnd w:id="22"/>
-    </w:p>
-    <w:p>
-      <w:pPr>
-        <w:rPr>
-          <w:rFonts w:ascii="Times New Roman" w:hAnsi="Times New Roman" w:cs="Times New Roman"/>
-          <w:color w:val="000000" w:themeColor="text1"/>
-          <w:lang w:val="en-GB"/>
-        </w:rPr>
-      </w:pPr>
-    </w:p>
-    <w:p>
-      <w:pPr>
-        <w:pStyle w:val="Heading3"/>
-        <w:rPr>
-          <w:rFonts w:cs="Times New Roman"/>
-          <w:color w:val="000000" w:themeColor="text1"/>
-          <w:lang w:val="en-GB"/>
-        </w:rPr>
-      </w:pPr>
-      <w:bookmarkStart w:id="23" w:name="_Toc226443707"/>
-      <w:r>
-        <w:rPr>
-          <w:rFonts w:cs="Times New Roman"/>
-          <w:color w:val="000000" w:themeColor="text1"/>
-          <w:lang w:val="en-GB"/>
-        </w:rPr>
-        <w:t>Wednesday, 15.04.2026</w:t>
-      </w:r>
-      <w:bookmarkEnd w:id="23"/>
-    </w:p>
-    <w:p>
-      <w:pPr>
-        <w:rPr>
-          <w:rFonts w:ascii="Times New Roman" w:hAnsi="Times New Roman" w:cs="Times New Roman"/>
-          <w:color w:val="000000" w:themeColor="text1"/>
-          <w:lang w:val="en-GB"/>
-        </w:rPr>
-      </w:pPr>
-    </w:p>
-    <w:p>
-      <w:pPr>
-        <w:pStyle w:val="Heading3"/>
-        <w:rPr>
-          <w:rFonts w:cs="Times New Roman"/>
-          <w:color w:val="000000" w:themeColor="text1"/>
-          <w:lang w:val="en-GB"/>
-        </w:rPr>
-      </w:pPr>
-      <w:bookmarkStart w:id="24" w:name="_Toc226443708"/>
-      <w:r>
-        <w:rPr>
-          <w:rFonts w:cs="Times New Roman"/>
-          <w:color w:val="000000" w:themeColor="text1"/>
-          <w:lang w:val="en-GB"/>
-        </w:rPr>
-        <w:t>Thursday, 16.04.2026</w:t>
-      </w:r>
-      <w:bookmarkEnd w:id="24"/>
-    </w:p>
-    <w:p>
-      <w:pPr>
-        <w:rPr>
-          <w:rFonts w:ascii="Times New Roman" w:hAnsi="Times New Roman" w:cs="Times New Roman"/>
-          <w:color w:val="000000" w:themeColor="text1"/>
-          <w:lang w:val="en-GB"/>
-        </w:rPr>
-      </w:pPr>
-    </w:p>
-    <w:p>
-      <w:pPr>
-        <w:pStyle w:val="Heading3"/>
-        <w:rPr>
-          <w:rFonts w:cs="Times New Roman"/>
-          <w:color w:val="000000" w:themeColor="text1"/>
-          <w:lang w:val="en-GB"/>
-        </w:rPr>
-      </w:pPr>
-      <w:bookmarkStart w:id="25" w:name="_Toc226443709"/>
-      <w:r>
-        <w:rPr>
-          <w:rFonts w:cs="Times New Roman"/>
-          <w:color w:val="000000" w:themeColor="text1"/>
-          <w:lang w:val="en-GB"/>
-        </w:rPr>
-        <w:t>Friday, 17.04.2026</w:t>
-      </w:r>
-      <w:bookmarkEnd w:id="25"/>
-    </w:p>
-    <w:p>
-      <w:pPr>
-        <w:rPr>
-          <w:rFonts w:ascii="Times New Roman" w:hAnsi="Times New Roman" w:cs="Times New Roman"/>
-          <w:color w:val="000000" w:themeColor="text1"/>
-          <w:lang w:val="en-GB"/>
-        </w:rPr>
-      </w:pPr>
-    </w:p>
-    <w:p>
-      <w:pPr>
-        <w:pStyle w:val="Heading3"/>
-        <w:rPr>
-          <w:rFonts w:cs="Times New Roman"/>
-          <w:color w:val="000000" w:themeColor="text1"/>
-          <w:lang w:val="en-GB"/>
-        </w:rPr>
-      </w:pPr>
-      <w:bookmarkStart w:id="26" w:name="_Toc226443710"/>
-      <w:r>
-        <w:rPr>
-          <w:rFonts w:cs="Times New Roman"/>
-          <w:color w:val="000000" w:themeColor="text1"/>
-          <w:lang w:val="en-GB"/>
-        </w:rPr>
-        <w:t>Tuesday, 21.04.2026</w:t>
-      </w:r>
-      <w:bookmarkEnd w:id="26"/>
-    </w:p>
-    <w:p>
-      <w:pPr>
-        <w:rPr>
-          <w:rFonts w:ascii="Times New Roman" w:hAnsi="Times New Roman" w:cs="Times New Roman"/>
-          <w:color w:val="000000" w:themeColor="text1"/>
-          <w:lang w:val="en-GB"/>
-        </w:rPr>
-      </w:pPr>
-    </w:p>
-    <w:p>
-      <w:pPr>
-        <w:pStyle w:val="Heading3"/>
-        <w:rPr>
-          <w:rFonts w:cs="Times New Roman"/>
-          <w:color w:val="000000" w:themeColor="text1"/>
-          <w:lang w:val="en-GB"/>
-        </w:rPr>
-      </w:pPr>
-      <w:bookmarkStart w:id="27" w:name="_Toc226443711"/>
+      <w:bookmarkStart w:id="35" w:name="_Toc226443719"/>
       <w:r>
         <w:rPr>
           <w:rFonts w:cs="Times New Roman"/>
@@ -6167,238 +6565,6 @@
           <w:lang w:val="en-GB"/>
         </w:rPr>
         <w:lastRenderedPageBreak/>
-        <w:t>Wednesday, 22.04.2026</w:t>
-      </w:r>
-      <w:bookmarkEnd w:id="27"/>
-    </w:p>
-    <w:p>
-      <w:pPr>
-        <w:rPr>
-          <w:rFonts w:ascii="Times New Roman" w:hAnsi="Times New Roman" w:cs="Times New Roman"/>
-          <w:color w:val="000000" w:themeColor="text1"/>
-          <w:lang w:val="en-GB"/>
-        </w:rPr>
-      </w:pPr>
-    </w:p>
-    <w:p>
-      <w:pPr>
-        <w:pStyle w:val="Heading2"/>
-        <w:rPr>
-          <w:rFonts w:cs="Times New Roman"/>
-          <w:color w:val="000000" w:themeColor="text1"/>
-          <w:lang w:val="en-GB"/>
-        </w:rPr>
-      </w:pPr>
-      <w:bookmarkStart w:id="28" w:name="_Toc226443712"/>
-      <w:r>
-        <w:rPr>
-          <w:rFonts w:cs="Times New Roman"/>
-          <w:color w:val="000000" w:themeColor="text1"/>
-          <w:lang w:val="en-GB"/>
-        </w:rPr>
-        <w:t>Personal FAZIT</w:t>
-      </w:r>
-      <w:bookmarkEnd w:id="28"/>
-    </w:p>
-    <w:p>
-      <w:pPr>
-        <w:rPr>
-          <w:rFonts w:ascii="Times New Roman" w:hAnsi="Times New Roman" w:cs="Times New Roman"/>
-          <w:color w:val="000000" w:themeColor="text1"/>
-          <w:lang w:val="en-GB"/>
-        </w:rPr>
-      </w:pPr>
-    </w:p>
-    <w:p>
-      <w:pPr>
-        <w:pStyle w:val="Heading1"/>
-        <w:rPr>
-          <w:rFonts w:cs="Times New Roman"/>
-          <w:color w:val="000000" w:themeColor="text1"/>
-          <w:lang w:val="en-GB"/>
-        </w:rPr>
-      </w:pPr>
-      <w:bookmarkStart w:id="29" w:name="_Toc226443713"/>
-      <w:r>
-        <w:rPr>
-          <w:rFonts w:cs="Times New Roman"/>
-          <w:color w:val="000000" w:themeColor="text1"/>
-          <w:lang w:val="en-GB"/>
-        </w:rPr>
-        <w:t>Project</w:t>
-      </w:r>
-      <w:bookmarkEnd w:id="29"/>
-    </w:p>
-    <w:p>
-      <w:pPr>
-        <w:rPr>
-          <w:rFonts w:ascii="Times New Roman" w:hAnsi="Times New Roman" w:cs="Times New Roman"/>
-          <w:color w:val="000000" w:themeColor="text1"/>
-          <w:lang w:val="en-GB"/>
-        </w:rPr>
-      </w:pPr>
-    </w:p>
-    <w:p>
-      <w:pPr>
-        <w:pStyle w:val="Heading2"/>
-        <w:rPr>
-          <w:rFonts w:cs="Times New Roman"/>
-          <w:color w:val="000000" w:themeColor="text1"/>
-          <w:lang w:val="en-GB"/>
-        </w:rPr>
-      </w:pPr>
-      <w:bookmarkStart w:id="30" w:name="_Toc226443714"/>
-      <w:r>
-        <w:rPr>
-          <w:rFonts w:cs="Times New Roman"/>
-          <w:color w:val="000000" w:themeColor="text1"/>
-          <w:lang w:val="en-GB"/>
-        </w:rPr>
-        <w:t>Summery</w:t>
-      </w:r>
-      <w:bookmarkEnd w:id="30"/>
-    </w:p>
-    <w:p>
-      <w:pPr>
-        <w:rPr>
-          <w:rFonts w:ascii="Times New Roman" w:hAnsi="Times New Roman" w:cs="Times New Roman"/>
-          <w:color w:val="000000" w:themeColor="text1"/>
-          <w:lang w:val="en-GB"/>
-        </w:rPr>
-      </w:pPr>
-    </w:p>
-    <w:p>
-      <w:pPr>
-        <w:pStyle w:val="Heading3"/>
-        <w:rPr>
-          <w:rFonts w:cs="Times New Roman"/>
-          <w:color w:val="000000" w:themeColor="text1"/>
-          <w:lang w:val="en-GB"/>
-        </w:rPr>
-      </w:pPr>
-      <w:bookmarkStart w:id="31" w:name="_Toc226443715"/>
-      <w:r>
-        <w:rPr>
-          <w:rFonts w:cs="Times New Roman"/>
-          <w:color w:val="000000" w:themeColor="text1"/>
-          <w:lang w:val="en-GB"/>
-        </w:rPr>
-        <w:t>Task</w:t>
-      </w:r>
-      <w:bookmarkEnd w:id="31"/>
-    </w:p>
-    <w:p>
-      <w:pPr>
-        <w:rPr>
-          <w:rFonts w:ascii="Times New Roman" w:hAnsi="Times New Roman" w:cs="Times New Roman"/>
-          <w:color w:val="000000" w:themeColor="text1"/>
-          <w:lang w:val="en-GB"/>
-        </w:rPr>
-      </w:pPr>
-    </w:p>
-    <w:p>
-      <w:pPr>
-        <w:pStyle w:val="Heading3"/>
-        <w:rPr>
-          <w:rFonts w:cs="Times New Roman"/>
-          <w:color w:val="000000" w:themeColor="text1"/>
-          <w:lang w:val="en-GB"/>
-        </w:rPr>
-      </w:pPr>
-      <w:bookmarkStart w:id="32" w:name="_Toc226443716"/>
-      <w:r>
-        <w:rPr>
-          <w:rFonts w:cs="Times New Roman"/>
-          <w:color w:val="000000" w:themeColor="text1"/>
-          <w:lang w:val="en-GB"/>
-        </w:rPr>
-        <w:t>Implementation</w:t>
-      </w:r>
-      <w:bookmarkEnd w:id="32"/>
-    </w:p>
-    <w:p>
-      <w:pPr>
-        <w:rPr>
-          <w:rFonts w:ascii="Times New Roman" w:hAnsi="Times New Roman" w:cs="Times New Roman"/>
-          <w:color w:val="000000" w:themeColor="text1"/>
-          <w:lang w:val="en-GB"/>
-        </w:rPr>
-      </w:pPr>
-    </w:p>
-    <w:p>
-      <w:pPr>
-        <w:pStyle w:val="Heading3"/>
-        <w:rPr>
-          <w:rFonts w:cs="Times New Roman"/>
-          <w:color w:val="000000" w:themeColor="text1"/>
-          <w:lang w:val="en-GB"/>
-        </w:rPr>
-      </w:pPr>
-      <w:bookmarkStart w:id="33" w:name="_Toc226443717"/>
-      <w:r>
-        <w:rPr>
-          <w:rFonts w:cs="Times New Roman"/>
-          <w:color w:val="000000" w:themeColor="text1"/>
-          <w:lang w:val="en-GB"/>
-        </w:rPr>
-        <w:t>Result</w:t>
-      </w:r>
-      <w:bookmarkEnd w:id="33"/>
-    </w:p>
-    <w:p>
-      <w:pPr>
-        <w:rPr>
-          <w:rFonts w:ascii="Times New Roman" w:hAnsi="Times New Roman" w:cs="Times New Roman"/>
-          <w:color w:val="000000" w:themeColor="text1"/>
-          <w:lang w:val="en-GB"/>
-        </w:rPr>
-      </w:pPr>
-    </w:p>
-    <w:p>
-      <w:pPr>
-        <w:pStyle w:val="Heading1"/>
-        <w:rPr>
-          <w:rFonts w:cs="Times New Roman"/>
-          <w:color w:val="000000" w:themeColor="text1"/>
-          <w:lang w:val="en-GB"/>
-        </w:rPr>
-      </w:pPr>
-      <w:bookmarkStart w:id="34" w:name="_Toc226443718"/>
-      <w:r>
-        <w:rPr>
-          <w:rFonts w:cs="Times New Roman"/>
-          <w:color w:val="000000" w:themeColor="text1"/>
-          <w:lang w:val="en-GB"/>
-        </w:rPr>
-        <w:t>IPERKA</w:t>
-      </w:r>
-      <w:bookmarkEnd w:id="34"/>
-    </w:p>
-    <w:p>
-      <w:pPr>
-        <w:rPr>
-          <w:rFonts w:ascii="Times New Roman" w:hAnsi="Times New Roman" w:cs="Times New Roman"/>
-          <w:color w:val="000000" w:themeColor="text1"/>
-          <w:lang w:val="en-GB"/>
-        </w:rPr>
-      </w:pPr>
-    </w:p>
-    <w:p>
-      <w:pPr>
-        <w:pStyle w:val="Heading2"/>
-        <w:rPr>
-          <w:rFonts w:cs="Times New Roman"/>
-          <w:color w:val="000000" w:themeColor="text1"/>
-          <w:lang w:val="en-GB"/>
-        </w:rPr>
-      </w:pPr>
-      <w:bookmarkStart w:id="35" w:name="_Toc226443719"/>
-      <w:r>
-        <w:rPr>
-          <w:rFonts w:cs="Times New Roman"/>
-          <w:color w:val="000000" w:themeColor="text1"/>
-          <w:lang w:val="en-GB"/>
-        </w:rPr>
         <w:t>Inform</w:t>
       </w:r>
       <w:r>
@@ -6772,16 +6938,7 @@
           <w:color w:val="153D63" w:themeColor="text2" w:themeTint="E6"/>
           <w:lang w:val="en-GB"/>
         </w:rPr>
-        <w:t xml:space="preserve">shall be accessed through a web </w:t>
-      </w:r>
-      <w:r>
-        <w:rPr>
-          <w:rFonts w:ascii="Times New Roman" w:hAnsi="Times New Roman" w:cs="Times New Roman"/>
-          <w:color w:val="153D63" w:themeColor="text2" w:themeTint="E6"/>
-          <w:lang w:val="en-GB"/>
-        </w:rPr>
-        <w:lastRenderedPageBreak/>
-        <w:t>browser and started locally</w:t>
+        <w:t>shall be accessed through a web browser and started locally</w:t>
       </w:r>
       <w:r>
         <w:rPr>
@@ -7103,6 +7260,7 @@
           <w:color w:val="000000" w:themeColor="text1"/>
           <w:lang w:val="en-GB"/>
         </w:rPr>
+        <w:lastRenderedPageBreak/>
         <w:t>Plan</w:t>
       </w:r>
       <w:r>
@@ -7252,49 +7410,6 @@
           <w:lang w:val="en-GB"/>
         </w:rPr>
       </w:pPr>
-      <w:r>
-        <w:rPr>
-          <w:rFonts w:ascii="Times New Roman" w:hAnsi="Times New Roman" w:cs="Times New Roman"/>
-          <w:color w:val="000000" w:themeColor="text1"/>
-          <w:lang w:val="en-GB"/>
-        </w:rPr>
-        <w:lastRenderedPageBreak/>
-        <w:drawing>
-          <wp:inline distT="0" distB="0" distL="0" distR="0" wp14:anchorId="4A630354" wp14:editId="5A6F6431">
-            <wp:extent cx="5760720" cy="1749425"/>
-            <wp:effectExtent l="0" t="0" r="0" b="3175"/>
-            <wp:docPr id="1867764143" name="Picture 1"/>
-            <wp:cNvGraphicFramePr>
-              <a:graphicFrameLocks xmlns:a="http://schemas.openxmlformats.org/drawingml/2006/main" noChangeAspect="1"/>
-            </wp:cNvGraphicFramePr>
-            <a:graphic xmlns:a="http://schemas.openxmlformats.org/drawingml/2006/main">
-              <a:graphicData uri="http://schemas.openxmlformats.org/drawingml/2006/picture">
-                <pic:pic xmlns:pic="http://schemas.openxmlformats.org/drawingml/2006/picture">
-                  <pic:nvPicPr>
-                    <pic:cNvPr id="1867764143" name=""/>
-                    <pic:cNvPicPr/>
-                  </pic:nvPicPr>
-                  <pic:blipFill>
-                    <a:blip r:embed="rId6"/>
-                    <a:stretch>
-                      <a:fillRect/>
-                    </a:stretch>
-                  </pic:blipFill>
-                  <pic:spPr>
-                    <a:xfrm>
-                      <a:off x="0" y="0"/>
-                      <a:ext cx="5760720" cy="1749425"/>
-                    </a:xfrm>
-                    <a:prstGeom prst="rect">
-                      <a:avLst/>
-                    </a:prstGeom>
-                  </pic:spPr>
-                </pic:pic>
-              </a:graphicData>
-            </a:graphic>
-          </wp:inline>
-        </w:drawing>
-      </w:r>
     </w:p>
     <w:p>
       <w:pPr>
@@ -7600,6 +7715,7 @@
           <w:color w:val="000000" w:themeColor="text1"/>
           <w:lang w:val="en-GB"/>
         </w:rPr>
+        <w:lastRenderedPageBreak/>
         <w:t>Backend</w:t>
       </w:r>
       <w:bookmarkEnd w:id="46"/>
@@ -7658,7 +7774,6 @@
           <w:color w:val="000000" w:themeColor="text1"/>
           <w:lang w:val="en-GB"/>
         </w:rPr>
-        <w:lastRenderedPageBreak/>
         <w:t>Containerisation</w:t>
       </w:r>
       <w:bookmarkEnd w:id="48"/>
@@ -8734,6 +8849,7 @@
   <w:style w:type="character" w:default="1" w:styleId="DefaultParagraphFont">
     <w:name w:val="Default Paragraph Font"/>
     <w:uiPriority w:val="1"/>
+    <w:semiHidden/>
     <w:unhideWhenUsed/>
   </w:style>
   <w:style w:type="table" w:default="1" w:styleId="TableNormal">

</xml_diff>